<commit_message>
Remove README badges, refresh final submission zip (report instead of PPT)
</commit_message>
<xml_diff>
--- a/Sellintelligence_Final_Report.docx
+++ b/Sellintelligence_Final_Report.docx
@@ -86,7 +86,19 @@
         <w:rPr>
           <w:sz w:val="24"/>
         </w:rPr>
-        <w:t>Date: 11 July 2026</w:t>
+        <w:t xml:space="preserve">Date: </w:t>
+      </w:r>
+      <w:r>
+        <w:rPr>
+          <w:sz w:val="24"/>
+        </w:rPr>
+        <w:t>14</w:t>
+      </w:r>
+      <w:r>
+        <w:rPr>
+          <w:sz w:val="24"/>
+        </w:rPr>
+        <w:t xml:space="preserve"> July 2026</w:t>
       </w:r>
     </w:p>
     <w:p>
@@ -282,15 +294,7 @@
     </w:p>
     <w:p>
       <w:r>
-        <w:t xml:space="preserve">Source: </w:t>
-      </w:r>
-      <w:proofErr w:type="gramStart"/>
-      <w:r>
-        <w:t>digital_marketing_campaign_dataset.csv - 8,000</w:t>
-      </w:r>
-      <w:proofErr w:type="gramEnd"/>
-      <w:r>
-        <w:t xml:space="preserve"> rows × 20 columns, no missing values.</w:t>
+        <w:t>Source: digital_marketing_campaign_dataset.csv - 8,000 rows × 20 columns, no missing values.</w:t>
       </w:r>
     </w:p>
     <w:tbl>
@@ -752,15 +756,7 @@
         <w:t>budget and</w:t>
       </w:r>
       <w:r>
-        <w:t xml:space="preserve"> </w:t>
-      </w:r>
-      <w:proofErr w:type="gramStart"/>
-      <w:r>
-        <w:t>there</w:t>
-      </w:r>
-      <w:proofErr w:type="gramEnd"/>
-      <w:r>
-        <w:t xml:space="preserve"> Logistic Regression wins decisively: it catches 73% of non-converters versus 33% for Gradient Boosting and just 7% for Random Forest. A model that misses two-thirds of the customers who won't buy cannot power an ad-suppression strategy, whatever its AUC. Logistic Regression is also fully interpretable: its coefficients quantify each feature's influence on conversion (Section 8), an important property for a stakeholder-facing marketing tool.</w:t>
+        <w:t xml:space="preserve"> there Logistic Regression wins decisively: it catches 73% of non-converters versus 33% for Gradient Boosting and just 7% for Random Forest. A model that misses two-thirds of the customers who won't buy cannot power an ad-suppression strategy, whatever its AUC. Logistic Regression is also fully interpretable: its coefficients quantify each feature's influence on conversion (Section 8), an important property for a stakeholder-facing marketing tool.</w:t>
       </w:r>
     </w:p>
     <w:p>
@@ -1291,15 +1287,7 @@
         <w:pStyle w:val="Heading2"/>
       </w:pPr>
       <w:r>
-        <w:t xml:space="preserve">7.2 Per-class </w:t>
-      </w:r>
-      <w:proofErr w:type="gramStart"/>
-      <w:r>
-        <w:t>detail - champion</w:t>
-      </w:r>
-      <w:proofErr w:type="gramEnd"/>
-      <w:r>
-        <w:t xml:space="preserve"> model</w:t>
+        <w:t>7.2 Per-class detail - champion model</w:t>
       </w:r>
     </w:p>
     <w:tbl>
@@ -1483,15 +1471,7 @@
     <w:p/>
     <w:p>
       <w:r>
-        <w:t xml:space="preserve">Class 0 recall of 0.73 means the model catches about 73% of customers who would not </w:t>
-      </w:r>
-      <w:proofErr w:type="gramStart"/>
-      <w:r>
-        <w:t>convert - each</w:t>
-      </w:r>
-      <w:proofErr w:type="gramEnd"/>
-      <w:r>
-        <w:t xml:space="preserve"> one a saved ad impression. Class 1 precision of 0.95 means when the model targets a customer, it is right 95% of the time.</w:t>
+        <w:t>Class 0 recall of 0.73 means the model catches about 73% of customers who would not convert - each one a saved ad impression. Class 1 precision of 0.95 means when the model targets a customer, it is right 95% of the time.</w:t>
       </w:r>
     </w:p>
     <w:p>
@@ -1557,23 +1537,7 @@
           <w:i/>
           <w:sz w:val="18"/>
         </w:rPr>
-        <w:t xml:space="preserve">Figure </w:t>
-      </w:r>
-      <w:proofErr w:type="gramStart"/>
-      <w:r>
-        <w:rPr>
-          <w:i/>
-          <w:sz w:val="18"/>
-        </w:rPr>
-        <w:t>2 - Champion</w:t>
-      </w:r>
-      <w:proofErr w:type="gramEnd"/>
-      <w:r>
-        <w:rPr>
-          <w:i/>
-          <w:sz w:val="18"/>
-        </w:rPr>
-        <w:t xml:space="preserve"> confusion matrix on the test set.</w:t>
+        <w:t>Figure 2 - Champion confusion matrix on the test set.</w:t>
       </w:r>
     </w:p>
     <w:p>
@@ -1593,8 +1557,8 @@
           <w:noProof/>
         </w:rPr>
         <w:drawing>
-          <wp:inline distT="0" distB="0" distL="0" distR="0" wp14:anchorId="63D44445" wp14:editId="614C057F">
-            <wp:extent cx="5303520" cy="3977640"/>
+          <wp:inline distT="0" distB="0" distL="0" distR="0" wp14:anchorId="63D44445" wp14:editId="161C305E">
+            <wp:extent cx="4936067" cy="3702050"/>
             <wp:effectExtent l="0" t="0" r="0" b="0"/>
             <wp:docPr id="3" name="Picture 3"/>
             <wp:cNvGraphicFramePr>
@@ -1616,7 +1580,7 @@
                   <pic:spPr>
                     <a:xfrm>
                       <a:off x="0" y="0"/>
-                      <a:ext cx="5303520" cy="3977640"/>
+                      <a:ext cx="4937736" cy="3703302"/>
                     </a:xfrm>
                     <a:prstGeom prst="rect">
                       <a:avLst/>
@@ -1638,24 +1602,7 @@
           <w:i/>
           <w:sz w:val="18"/>
         </w:rPr>
-        <w:lastRenderedPageBreak/>
-        <w:t xml:space="preserve">Figure </w:t>
-      </w:r>
-      <w:proofErr w:type="gramStart"/>
-      <w:r>
-        <w:rPr>
-          <w:i/>
-          <w:sz w:val="18"/>
-        </w:rPr>
-        <w:t>3 - ROC</w:t>
-      </w:r>
-      <w:proofErr w:type="gramEnd"/>
-      <w:r>
-        <w:rPr>
-          <w:i/>
-          <w:sz w:val="18"/>
-        </w:rPr>
-        <w:t xml:space="preserve"> curves for all four classifiers.</w:t>
+        <w:t>Figure 3 - ROC curves for all four classifiers.</w:t>
       </w:r>
     </w:p>
     <w:p>
@@ -1663,6 +1610,7 @@
         <w:pStyle w:val="Heading2"/>
       </w:pPr>
       <w:r>
+        <w:lastRenderedPageBreak/>
         <w:t>7.5 Precision-Recall curves</w:t>
       </w:r>
     </w:p>
@@ -2709,15 +2657,7 @@
         <w:pStyle w:val="ListBullet"/>
       </w:pPr>
       <w:r>
-        <w:t xml:space="preserve">Demographics are secondary: age and income influence conversion far less than </w:t>
-      </w:r>
-      <w:proofErr w:type="gramStart"/>
-      <w:r>
-        <w:t>behaviour - target</w:t>
-      </w:r>
-      <w:proofErr w:type="gramEnd"/>
-      <w:r>
-        <w:t xml:space="preserve"> on behaviour, not demographics.</w:t>
+        <w:t>Demographics are secondary: age and income influence conversion far less than behaviour - target on behaviour, not demographics.</w:t>
       </w:r>
     </w:p>
     <w:p>
@@ -2945,23 +2885,7 @@
           <w:i/>
           <w:sz w:val="18"/>
         </w:rPr>
-        <w:t xml:space="preserve">Figure </w:t>
-      </w:r>
-      <w:proofErr w:type="gramStart"/>
-      <w:r>
-        <w:rPr>
-          <w:i/>
-          <w:sz w:val="18"/>
-        </w:rPr>
-        <w:t>7 - Churn</w:t>
-      </w:r>
-      <w:proofErr w:type="gramEnd"/>
-      <w:r>
-        <w:rPr>
-          <w:i/>
-          <w:sz w:val="18"/>
-        </w:rPr>
-        <w:t xml:space="preserve"> rate by campaign channel and age band.</w:t>
+        <w:t>Figure 7 - Churn rate by campaign channel and age band.</w:t>
       </w:r>
     </w:p>
     <w:p>
@@ -3502,23 +3426,7 @@
           <w:i/>
           <w:sz w:val="18"/>
         </w:rPr>
-        <w:t xml:space="preserve">Figure </w:t>
-      </w:r>
-      <w:proofErr w:type="gramStart"/>
-      <w:r>
-        <w:rPr>
-          <w:i/>
-          <w:sz w:val="18"/>
-        </w:rPr>
-        <w:t>8 - AI</w:t>
-      </w:r>
-      <w:proofErr w:type="gramEnd"/>
-      <w:r>
-        <w:rPr>
-          <w:i/>
-          <w:sz w:val="18"/>
-        </w:rPr>
-        <w:t xml:space="preserve"> lead-quality distribution.</w:t>
+        <w:t>Figure 8 - AI lead-quality distribution.</w:t>
       </w:r>
     </w:p>
     <w:tbl>
@@ -3947,16 +3855,11 @@
       <w:pPr>
         <w:pStyle w:val="ListBullet"/>
       </w:pPr>
-      <w:proofErr w:type="spellStart"/>
       <w:r>
         <w:t>Sellintelligence_</w:t>
       </w:r>
       <w:r>
-        <w:t>EDA.ipynb</w:t>
-      </w:r>
-      <w:proofErr w:type="spellEnd"/>
-      <w:r>
-        <w:t xml:space="preserve"> full</w:t>
+        <w:t>EDA.ipynb full</w:t>
       </w:r>
       <w:r>
         <w:t xml:space="preserve"> analysis notebook (12 phases: loading, EDA, feature engineering, model selection across 4 classifiers, evaluation, lead scoring, churn curation, Power BI exports, PR curves)</w:t>
@@ -3967,26 +3870,18 @@
         <w:pStyle w:val="ListBullet"/>
       </w:pPr>
       <w:r>
-        <w:t>Sellintelligence_Final_Report.docx this</w:t>
-      </w:r>
-      <w:r>
-        <w:t xml:space="preserve"> report</w:t>
+        <w:t>Sellintelligence_Final_Report.docx this report</w:t>
       </w:r>
     </w:p>
     <w:p>
       <w:pPr>
         <w:pStyle w:val="ListBullet"/>
       </w:pPr>
-      <w:proofErr w:type="spellStart"/>
       <w:r>
         <w:t>Sellintelligence_ROAS_Optimization_</w:t>
       </w:r>
       <w:r>
-        <w:t>Dashboard.pbix</w:t>
-      </w:r>
-      <w:proofErr w:type="spellEnd"/>
-      <w:r>
-        <w:t xml:space="preserve"> 3</w:t>
+        <w:t>Dashboard.pbix 3</w:t>
       </w:r>
       <w:r>
         <w:t>-page Power BI dashboard</w:t>
@@ -3996,21 +3891,8 @@
       <w:pPr>
         <w:pStyle w:val="ListBullet"/>
       </w:pPr>
-      <w:proofErr w:type="spellStart"/>
       <w:r>
-        <w:t>Sellintelligence_Final_Model.pkl</w:t>
-      </w:r>
-      <w:proofErr w:type="spellEnd"/>
-      <w:r>
-        <w:t xml:space="preserve"> </w:t>
-      </w:r>
-      <w:proofErr w:type="spellStart"/>
-      <w:r>
-        <w:t>serialised</w:t>
-      </w:r>
-      <w:proofErr w:type="spellEnd"/>
-      <w:r>
-        <w:t xml:space="preserve"> champion model</w:t>
+        <w:t>Sellintelligence_Final_Model.pkl serialised champion model</w:t>
       </w:r>
     </w:p>
     <w:p>

</xml_diff>